<commit_message>
feat: add Єдиний Акт Списання (EAS) report with cross-report conversions
Co-Authored-By: Claude Sonnet 4.6 <noreply@anthropic.com>
</commit_message>
<xml_diff>
--- a/Mil.Paperwork.Domain/Templates/AssetValuationReportTemplate.docx
+++ b/Mil.Paperwork.Domain/Templates/AssetValuationReportTemplate.docx
@@ -1,6 +1,6 @@
 
 <file path=word/document.xml><?xml version="1.0" encoding="utf-8"?>
-<w:document xmlns:wpc="http://schemas.microsoft.com/office/word/2010/wordprocessingCanvas" xmlns:cx="http://schemas.microsoft.com/office/drawing/2014/chartex" xmlns:cx1="http://schemas.microsoft.com/office/drawing/2015/9/8/chartex" xmlns:cx2="http://schemas.microsoft.com/office/drawing/2015/10/21/chartex" xmlns:cx3="http://schemas.microsoft.com/office/drawing/2016/5/9/chartex" xmlns:cx4="http://schemas.microsoft.com/office/drawing/2016/5/10/chartex" xmlns:cx5="http://schemas.microsoft.com/office/drawing/2016/5/11/chartex" xmlns:cx6="http://schemas.microsoft.com/office/drawing/2016/5/12/chartex" xmlns:cx7="http://schemas.microsoft.com/office/drawing/2016/5/13/chartex" xmlns:cx8="http://schemas.microsoft.com/office/drawing/2016/5/14/chartex" xmlns:mc="http://schemas.openxmlformats.org/markup-compatibility/2006" xmlns:aink="http://schemas.microsoft.com/office/drawing/2016/ink" xmlns:am3d="http://schemas.microsoft.com/office/drawing/2017/model3d" xmlns:o="urn:schemas-microsoft-com:office:office" xmlns:r="http://schemas.openxmlformats.org/officeDocument/2006/relationships" xmlns:m="http://schemas.openxmlformats.org/officeDocument/2006/math" xmlns:v="urn:schemas-microsoft-com:vml" xmlns:wp14="http://schemas.microsoft.com/office/word/2010/wordprocessingDrawing" xmlns:wp="http://schemas.openxmlformats.org/drawingml/2006/wordprocessingDrawing" xmlns:w10="urn:schemas-microsoft-com:office:word" xmlns:w="http://schemas.openxmlformats.org/wordprocessingml/2006/main" xmlns:w14="http://schemas.microsoft.com/office/word/2010/wordml" xmlns:w15="http://schemas.microsoft.com/office/word/2012/wordml" xmlns:w16cex="http://schemas.microsoft.com/office/word/2018/wordml/cex" xmlns:w16cid="http://schemas.microsoft.com/office/word/2016/wordml/cid" xmlns:w16="http://schemas.microsoft.com/office/word/2018/wordml" xmlns:w16sdtdh="http://schemas.microsoft.com/office/word/2020/wordml/sdtdatahash" xmlns:w16se="http://schemas.microsoft.com/office/word/2015/wordml/symex" xmlns:wpg="http://schemas.microsoft.com/office/word/2010/wordprocessingGroup" xmlns:wpi="http://schemas.microsoft.com/office/word/2010/wordprocessingInk" xmlns:wne="http://schemas.microsoft.com/office/word/2006/wordml" xmlns:wps="http://schemas.microsoft.com/office/word/2010/wordprocessingShape" mc:Ignorable="w14 w15 w16se w16cid w16 w16cex w16sdtdh wp14">
+<w:document xmlns:wpc="http://schemas.microsoft.com/office/word/2010/wordprocessingCanvas" xmlns:cx="http://schemas.microsoft.com/office/drawing/2014/chartex" xmlns:cx1="http://schemas.microsoft.com/office/drawing/2015/9/8/chartex" xmlns:cx2="http://schemas.microsoft.com/office/drawing/2015/10/21/chartex" xmlns:cx3="http://schemas.microsoft.com/office/drawing/2016/5/9/chartex" xmlns:cx4="http://schemas.microsoft.com/office/drawing/2016/5/10/chartex" xmlns:cx5="http://schemas.microsoft.com/office/drawing/2016/5/11/chartex" xmlns:cx6="http://schemas.microsoft.com/office/drawing/2016/5/12/chartex" xmlns:cx7="http://schemas.microsoft.com/office/drawing/2016/5/13/chartex" xmlns:cx8="http://schemas.microsoft.com/office/drawing/2016/5/14/chartex" xmlns:mc="http://schemas.openxmlformats.org/markup-compatibility/2006" xmlns:aink="http://schemas.microsoft.com/office/drawing/2016/ink" xmlns:am3d="http://schemas.microsoft.com/office/drawing/2017/model3d" xmlns:o="urn:schemas-microsoft-com:office:office" xmlns:oel="http://schemas.microsoft.com/office/2019/extlst" xmlns:r="http://schemas.openxmlformats.org/officeDocument/2006/relationships" xmlns:m="http://schemas.openxmlformats.org/officeDocument/2006/math" xmlns:v="urn:schemas-microsoft-com:vml" xmlns:wp14="http://schemas.microsoft.com/office/word/2010/wordprocessingDrawing" xmlns:wp="http://schemas.openxmlformats.org/drawingml/2006/wordprocessingDrawing" xmlns:w10="urn:schemas-microsoft-com:office:word" xmlns:w="http://schemas.openxmlformats.org/wordprocessingml/2006/main" xmlns:w14="http://schemas.microsoft.com/office/word/2010/wordml" xmlns:w15="http://schemas.microsoft.com/office/word/2012/wordml" xmlns:w16cex="http://schemas.microsoft.com/office/word/2018/wordml/cex" xmlns:w16cid="http://schemas.microsoft.com/office/word/2016/wordml/cid" xmlns:w16="http://schemas.microsoft.com/office/word/2018/wordml" xmlns:w16du="http://schemas.microsoft.com/office/word/2023/wordml/word16du" xmlns:w16sdtdh="http://schemas.microsoft.com/office/word/2020/wordml/sdtdatahash" xmlns:w16se="http://schemas.microsoft.com/office/word/2015/wordml/symex" xmlns:wpg="http://schemas.microsoft.com/office/word/2010/wordprocessingGroup" xmlns:wpi="http://schemas.microsoft.com/office/word/2010/wordprocessingInk" xmlns:wne="http://schemas.microsoft.com/office/word/2006/wordml" xmlns:wps="http://schemas.microsoft.com/office/word/2010/wordprocessingShape" mc:Ignorable="w14 w15 w16se w16cid w16 w16cex w16sdtdh w16du wp14">
   <w:body>
     <w:tbl>
       <w:tblPr>
@@ -73,11 +73,46 @@
             </w:pPr>
             <w:r>
               <w:rPr>
-                <w:color w:val="000000"/>
-                <w:sz w:val="22"/>
-                <w:szCs w:val="22"/>
-              </w:rPr>
-              <w:t xml:space="preserve">Командир військової частини </w:t>
+                <w:color w:val="000000" w:themeColor="text1"/>
+                <w:lang w:val="ru-RU"/>
+              </w:rPr>
+              <w:fldChar w:fldCharType="begin"/>
+            </w:r>
+            <w:r>
+              <w:rPr>
+                <w:color w:val="000000" w:themeColor="text1"/>
+                <w:lang w:val="ru-RU"/>
+              </w:rPr>
+              <w:instrText xml:space="preserve"> MERGEFIELD  COMM_POSITION  \* MERGEFORMAT </w:instrText>
+            </w:r>
+            <w:r>
+              <w:rPr>
+                <w:color w:val="000000" w:themeColor="text1"/>
+                <w:lang w:val="ru-RU"/>
+              </w:rPr>
+              <w:fldChar w:fldCharType="separate"/>
+            </w:r>
+            <w:r>
+              <w:rPr>
+                <w:noProof/>
+                <w:color w:val="000000" w:themeColor="text1"/>
+                <w:lang w:val="ru-RU"/>
+              </w:rPr>
+              <w:t>«COMM_POSITION»</w:t>
+            </w:r>
+            <w:r>
+              <w:rPr>
+                <w:color w:val="000000" w:themeColor="text1"/>
+                <w:lang w:val="ru-RU"/>
+              </w:rPr>
+              <w:fldChar w:fldCharType="end"/>
+            </w:r>
+            <w:r>
+              <w:rPr>
+                <w:color w:val="000000" w:themeColor="text1"/>
+                <w:lang w:val="en-US"/>
+              </w:rPr>
+              <w:t xml:space="preserve"> </w:t>
             </w:r>
             <w:r>
               <w:rPr>
@@ -255,7 +290,7 @@
                 <w:noProof/>
                 <w:lang w:val="ru-RU"/>
               </w:rPr>
-              <w:t>2025</w:t>
+              <w:t>2026</w:t>
             </w:r>
             <w:r>
               <w:fldChar w:fldCharType="end"/>
@@ -2162,27 +2197,14 @@
                 <w:lang w:val="en-US"/>
               </w:rPr>
             </w:pPr>
-            <w:r>
-              <w:fldChar w:fldCharType="begin"/>
-            </w:r>
-            <w:r>
-              <w:instrText xml:space="preserve"> MERGEFIELD  HEAD_OF_FINANCE_POSITION  \* MERGEFORMAT </w:instrText>
-            </w:r>
-            <w:r>
-              <w:fldChar w:fldCharType="separate"/>
-            </w:r>
-            <w:r>
-              <w:rPr>
-                <w:noProof/>
-              </w:rPr>
-              <w:t>«HEAD_OF_FINANCE_POSITION»</w:t>
-            </w:r>
-            <w:r>
-              <w:rPr>
-                <w:noProof/>
-              </w:rPr>
-              <w:fldChar w:fldCharType="end"/>
-            </w:r>
+            <w:fldSimple w:instr=" MERGEFIELD  HEAD_OF_FINANCE_POSITION  \* MERGEFORMAT ">
+              <w:r>
+                <w:rPr>
+                  <w:noProof/>
+                </w:rPr>
+                <w:t>«HEAD_OF_FINANCE_POSITION»</w:t>
+              </w:r>
+            </w:fldSimple>
           </w:p>
           <w:p>
             <w:pPr>
@@ -2237,27 +2259,14 @@
                 <w:lang w:val="en-US"/>
               </w:rPr>
             </w:pPr>
-            <w:r>
-              <w:fldChar w:fldCharType="begin"/>
-            </w:r>
-            <w:r>
-              <w:instrText xml:space="preserve"> MERGEFIELD  HEAD_OF_FINANCE_RANK  \* MERGEFORMAT </w:instrText>
-            </w:r>
-            <w:r>
-              <w:fldChar w:fldCharType="separate"/>
-            </w:r>
-            <w:r>
-              <w:rPr>
-                <w:noProof/>
-              </w:rPr>
-              <w:t>«HEAD_OF_FINANCE_RANK»</w:t>
-            </w:r>
-            <w:r>
-              <w:rPr>
-                <w:noProof/>
-              </w:rPr>
-              <w:fldChar w:fldCharType="end"/>
-            </w:r>
+            <w:fldSimple w:instr=" MERGEFIELD  HEAD_OF_FINANCE_RANK  \* MERGEFORMAT ">
+              <w:r>
+                <w:rPr>
+                  <w:noProof/>
+                </w:rPr>
+                <w:t>«HEAD_OF_FINANCE_RANK»</w:t>
+              </w:r>
+            </w:fldSimple>
           </w:p>
         </w:tc>
         <w:tc>
@@ -2288,27 +2297,14 @@
                 <w:lang w:val="en-US"/>
               </w:rPr>
             </w:pPr>
-            <w:r>
-              <w:fldChar w:fldCharType="begin"/>
-            </w:r>
-            <w:r>
-              <w:instrText xml:space="preserve"> MERGEFIELD  HEAD_OF_FINANCE_NAME  \* MERGEFORMAT </w:instrText>
-            </w:r>
-            <w:r>
-              <w:fldChar w:fldCharType="separate"/>
-            </w:r>
-            <w:r>
-              <w:rPr>
-                <w:noProof/>
-              </w:rPr>
-              <w:t>«HEAD_OF_FINANCE_NAME»</w:t>
-            </w:r>
-            <w:r>
-              <w:rPr>
-                <w:noProof/>
-              </w:rPr>
-              <w:fldChar w:fldCharType="end"/>
-            </w:r>
+            <w:fldSimple w:instr=" MERGEFIELD  HEAD_OF_FINANCE_NAME  \* MERGEFORMAT ">
+              <w:r>
+                <w:rPr>
+                  <w:noProof/>
+                </w:rPr>
+                <w:t>«HEAD_OF_FINANCE_NAME»</w:t>
+              </w:r>
+            </w:fldSimple>
           </w:p>
         </w:tc>
       </w:tr>
@@ -2339,27 +2335,14 @@
               <w:ind w:left="-101" w:right="-109"/>
               <w:jc w:val="both"/>
             </w:pPr>
-            <w:r>
-              <w:fldChar w:fldCharType="begin"/>
-            </w:r>
-            <w:r>
-              <w:instrText xml:space="preserve"> MERGEFIELD  HEAD_OF_SERVICE_POSITION  \* MERGEFORMAT </w:instrText>
-            </w:r>
-            <w:r>
-              <w:fldChar w:fldCharType="separate"/>
-            </w:r>
-            <w:r>
-              <w:rPr>
-                <w:noProof/>
-              </w:rPr>
-              <w:t>«HEAD_OF_SERVICE_POSITION»</w:t>
-            </w:r>
-            <w:r>
-              <w:rPr>
-                <w:noProof/>
-              </w:rPr>
-              <w:fldChar w:fldCharType="end"/>
-            </w:r>
+            <w:fldSimple w:instr=" MERGEFIELD  HEAD_OF_SERVICE_POSITION  \* MERGEFORMAT ">
+              <w:r>
+                <w:rPr>
+                  <w:noProof/>
+                </w:rPr>
+                <w:t>«HEAD_OF_SERVICE_POSITION»</w:t>
+              </w:r>
+            </w:fldSimple>
           </w:p>
           <w:p>
             <w:pPr>
@@ -2411,27 +2394,14 @@
               <w:ind w:left="-101"/>
               <w:jc w:val="both"/>
             </w:pPr>
-            <w:r>
-              <w:fldChar w:fldCharType="begin"/>
-            </w:r>
-            <w:r>
-              <w:instrText xml:space="preserve"> MERGEFIELD  HEAD_OF_SERVICE_RANK  \* MERGEFORMAT </w:instrText>
-            </w:r>
-            <w:r>
-              <w:fldChar w:fldCharType="separate"/>
-            </w:r>
-            <w:r>
-              <w:rPr>
-                <w:noProof/>
-              </w:rPr>
-              <w:t>«HEAD_OF_SERVICE_RANK»</w:t>
-            </w:r>
-            <w:r>
-              <w:rPr>
-                <w:noProof/>
-              </w:rPr>
-              <w:fldChar w:fldCharType="end"/>
-            </w:r>
+            <w:fldSimple w:instr=" MERGEFIELD  HEAD_OF_SERVICE_RANK  \* MERGEFORMAT ">
+              <w:r>
+                <w:rPr>
+                  <w:noProof/>
+                </w:rPr>
+                <w:t>«HEAD_OF_SERVICE_RANK»</w:t>
+              </w:r>
+            </w:fldSimple>
           </w:p>
         </w:tc>
         <w:tc>
@@ -2462,30 +2432,14 @@
                 <w:lang w:val="en-US"/>
               </w:rPr>
             </w:pPr>
-            <w:r>
-              <w:fldChar w:fldCharType="begin"/>
-            </w:r>
-            <w:r>
-              <w:instrText xml:space="preserve"> MERGEFIELD </w:instrText>
-            </w:r>
-            <w:r>
-              <w:instrText xml:space="preserve"> HEAD_OF_SERVICE_NAME  \* MERGEFORMAT </w:instrText>
-            </w:r>
-            <w:r>
-              <w:fldChar w:fldCharType="separate"/>
-            </w:r>
-            <w:r>
-              <w:rPr>
-                <w:noProof/>
-              </w:rPr>
-              <w:t>«HEAD_OF_SERVICE_NAME»</w:t>
-            </w:r>
-            <w:r>
-              <w:rPr>
-                <w:noProof/>
-              </w:rPr>
-              <w:fldChar w:fldCharType="end"/>
-            </w:r>
+            <w:fldSimple w:instr=" MERGEFIELD  HEAD_OF_SERVICE_NAME  \* MERGEFORMAT ">
+              <w:r>
+                <w:rPr>
+                  <w:noProof/>
+                </w:rPr>
+                <w:t>«HEAD_OF_SERVICE_NAME»</w:t>
+              </w:r>
+            </w:fldSimple>
           </w:p>
         </w:tc>
       </w:tr>
@@ -2516,7 +2470,7 @@
 </file>
 
 <file path=word/numbering.xml><?xml version="1.0" encoding="utf-8"?>
-<w:numbering xmlns:wpc="http://schemas.microsoft.com/office/word/2010/wordprocessingCanvas" xmlns:cx="http://schemas.microsoft.com/office/drawing/2014/chartex" xmlns:cx1="http://schemas.microsoft.com/office/drawing/2015/9/8/chartex" xmlns:cx2="http://schemas.microsoft.com/office/drawing/2015/10/21/chartex" xmlns:cx3="http://schemas.microsoft.com/office/drawing/2016/5/9/chartex" xmlns:cx4="http://schemas.microsoft.com/office/drawing/2016/5/10/chartex" xmlns:cx5="http://schemas.microsoft.com/office/drawing/2016/5/11/chartex" xmlns:cx6="http://schemas.microsoft.com/office/drawing/2016/5/12/chartex" xmlns:cx7="http://schemas.microsoft.com/office/drawing/2016/5/13/chartex" xmlns:cx8="http://schemas.microsoft.com/office/drawing/2016/5/14/chartex" xmlns:mc="http://schemas.openxmlformats.org/markup-compatibility/2006" xmlns:aink="http://schemas.microsoft.com/office/drawing/2016/ink" xmlns:am3d="http://schemas.microsoft.com/office/drawing/2017/model3d" xmlns:o="urn:schemas-microsoft-com:office:office" xmlns:r="http://schemas.openxmlformats.org/officeDocument/2006/relationships" xmlns:m="http://schemas.openxmlformats.org/officeDocument/2006/math" xmlns:v="urn:schemas-microsoft-com:vml" xmlns:wp14="http://schemas.microsoft.com/office/word/2010/wordprocessingDrawing" xmlns:wp="http://schemas.openxmlformats.org/drawingml/2006/wordprocessingDrawing" xmlns:w10="urn:schemas-microsoft-com:office:word" xmlns:w="http://schemas.openxmlformats.org/wordprocessingml/2006/main" xmlns:w14="http://schemas.microsoft.com/office/word/2010/wordml" xmlns:w15="http://schemas.microsoft.com/office/word/2012/wordml" xmlns:w16cex="http://schemas.microsoft.com/office/word/2018/wordml/cex" xmlns:w16cid="http://schemas.microsoft.com/office/word/2016/wordml/cid" xmlns:w16="http://schemas.microsoft.com/office/word/2018/wordml" xmlns:w16sdtdh="http://schemas.microsoft.com/office/word/2020/wordml/sdtdatahash" xmlns:w16se="http://schemas.microsoft.com/office/word/2015/wordml/symex" xmlns:wpg="http://schemas.microsoft.com/office/word/2010/wordprocessingGroup" xmlns:wpi="http://schemas.microsoft.com/office/word/2010/wordprocessingInk" xmlns:wne="http://schemas.microsoft.com/office/word/2006/wordml" xmlns:wps="http://schemas.microsoft.com/office/word/2010/wordprocessingShape" mc:Ignorable="w14 w15 w16se w16cid w16 w16cex w16sdtdh wp14">
+<w:numbering xmlns:wpc="http://schemas.microsoft.com/office/word/2010/wordprocessingCanvas" xmlns:cx="http://schemas.microsoft.com/office/drawing/2014/chartex" xmlns:cx1="http://schemas.microsoft.com/office/drawing/2015/9/8/chartex" xmlns:cx2="http://schemas.microsoft.com/office/drawing/2015/10/21/chartex" xmlns:cx3="http://schemas.microsoft.com/office/drawing/2016/5/9/chartex" xmlns:cx4="http://schemas.microsoft.com/office/drawing/2016/5/10/chartex" xmlns:cx5="http://schemas.microsoft.com/office/drawing/2016/5/11/chartex" xmlns:cx6="http://schemas.microsoft.com/office/drawing/2016/5/12/chartex" xmlns:cx7="http://schemas.microsoft.com/office/drawing/2016/5/13/chartex" xmlns:cx8="http://schemas.microsoft.com/office/drawing/2016/5/14/chartex" xmlns:mc="http://schemas.openxmlformats.org/markup-compatibility/2006" xmlns:aink="http://schemas.microsoft.com/office/drawing/2016/ink" xmlns:am3d="http://schemas.microsoft.com/office/drawing/2017/model3d" xmlns:o="urn:schemas-microsoft-com:office:office" xmlns:oel="http://schemas.microsoft.com/office/2019/extlst" xmlns:r="http://schemas.openxmlformats.org/officeDocument/2006/relationships" xmlns:m="http://schemas.openxmlformats.org/officeDocument/2006/math" xmlns:v="urn:schemas-microsoft-com:vml" xmlns:wp14="http://schemas.microsoft.com/office/word/2010/wordprocessingDrawing" xmlns:wp="http://schemas.openxmlformats.org/drawingml/2006/wordprocessingDrawing" xmlns:w10="urn:schemas-microsoft-com:office:word" xmlns:w="http://schemas.openxmlformats.org/wordprocessingml/2006/main" xmlns:w14="http://schemas.microsoft.com/office/word/2010/wordml" xmlns:w15="http://schemas.microsoft.com/office/word/2012/wordml" xmlns:w16cex="http://schemas.microsoft.com/office/word/2018/wordml/cex" xmlns:w16cid="http://schemas.microsoft.com/office/word/2016/wordml/cid" xmlns:w16="http://schemas.microsoft.com/office/word/2018/wordml" xmlns:w16du="http://schemas.microsoft.com/office/word/2023/wordml/word16du" xmlns:w16sdtdh="http://schemas.microsoft.com/office/word/2020/wordml/sdtdatahash" xmlns:w16se="http://schemas.microsoft.com/office/word/2015/wordml/symex" xmlns:wpg="http://schemas.microsoft.com/office/word/2010/wordprocessingGroup" xmlns:wpi="http://schemas.microsoft.com/office/word/2010/wordprocessingInk" xmlns:wne="http://schemas.microsoft.com/office/word/2006/wordml" xmlns:wps="http://schemas.microsoft.com/office/word/2010/wordprocessingShape" mc:Ignorable="w14 w15 w16se w16cid w16 w16cex w16sdtdh w16du wp14">
   <w:abstractNum w:abstractNumId="0" w15:restartNumberingAfterBreak="0">
     <w:nsid w:val="73886BF0"/>
     <w:multiLevelType w:val="multilevel"/>
@@ -2603,14 +2557,14 @@
       </w:pPr>
     </w:lvl>
   </w:abstractNum>
-  <w:num w:numId="1">
+  <w:num w:numId="1" w16cid:durableId="1468742214">
     <w:abstractNumId w:val="0"/>
   </w:num>
 </w:numbering>
 </file>
 
 <file path=word/styles.xml><?xml version="1.0" encoding="utf-8"?>
-<w:styles xmlns:mc="http://schemas.openxmlformats.org/markup-compatibility/2006" xmlns:r="http://schemas.openxmlformats.org/officeDocument/2006/relationships" xmlns:w="http://schemas.openxmlformats.org/wordprocessingml/2006/main" xmlns:w14="http://schemas.microsoft.com/office/word/2010/wordml" xmlns:w15="http://schemas.microsoft.com/office/word/2012/wordml" xmlns:w16cex="http://schemas.microsoft.com/office/word/2018/wordml/cex" xmlns:w16cid="http://schemas.microsoft.com/office/word/2016/wordml/cid" xmlns:w16="http://schemas.microsoft.com/office/word/2018/wordml" xmlns:w16sdtdh="http://schemas.microsoft.com/office/word/2020/wordml/sdtdatahash" xmlns:w16se="http://schemas.microsoft.com/office/word/2015/wordml/symex" mc:Ignorable="w14 w15 w16se w16cid w16 w16cex w16sdtdh">
+<w:styles xmlns:mc="http://schemas.openxmlformats.org/markup-compatibility/2006" xmlns:r="http://schemas.openxmlformats.org/officeDocument/2006/relationships" xmlns:w="http://schemas.openxmlformats.org/wordprocessingml/2006/main" xmlns:w14="http://schemas.microsoft.com/office/word/2010/wordml" xmlns:w15="http://schemas.microsoft.com/office/word/2012/wordml" xmlns:w16cex="http://schemas.microsoft.com/office/word/2018/wordml/cex" xmlns:w16cid="http://schemas.microsoft.com/office/word/2016/wordml/cid" xmlns:w16="http://schemas.microsoft.com/office/word/2018/wordml" xmlns:w16du="http://schemas.microsoft.com/office/word/2023/wordml/word16du" xmlns:w16sdtdh="http://schemas.microsoft.com/office/word/2020/wordml/sdtdatahash" xmlns:w16se="http://schemas.microsoft.com/office/word/2015/wordml/symex" mc:Ignorable="w14 w15 w16se w16cid w16 w16cex w16sdtdh w16du">
   <w:docDefaults>
     <w:rPrDefault>
       <w:rPr>

</xml_diff>